<commit_message>
docs(use-case): revise use-case descriptions
</commit_message>
<xml_diff>
--- a/diagrams/use-case-description/ResBack Use Case Descriptions.docx
+++ b/diagrams/use-case-description/ResBack Use Case Descriptions.docx
@@ -1076,7 +1076,7 @@
                 <w:rFonts w:ascii="Arial" w:hAnsi="Arial"/>
                 <w:sz w:val="20"/>
               </w:rPr>
-              <w:t>Student, Faculty/Staff, Admin or Super Admin</w:t>
+              <w:t>Student, Faculty, Admin or Super Admin</w:t>
             </w:r>
           </w:p>
         </w:tc>
@@ -1513,7 +1513,7 @@
                 <w:rFonts w:ascii="Arial" w:hAnsi="Arial"/>
                 <w:sz w:val="20"/>
               </w:rPr>
-              <w:t>8. Opens the Student feedback form or the Faculty/Staff, Admin or Super Admin dashboard according to the account role.</w:t>
+              <w:t>8. Opens the Student feedback form or the Faculty, Admin or Super Admin dashboard according to the account role.</w:t>
             </w:r>
           </w:p>
         </w:tc>
@@ -1857,7 +1857,7 @@
                 <w:rFonts w:ascii="Arial" w:hAnsi="Arial"/>
                 <w:sz w:val="20"/>
               </w:rPr>
-              <w:t>Allows a Student or Faculty/Staff member to submit confidential CCIS feedback for screening and, when accepted, automatic analysis.</w:t>
+              <w:t>Allows a Student or Faculty member to submit confidential CCIS feedback for screening and, when accepted, automatic analysis.</w:t>
             </w:r>
           </w:p>
         </w:tc>
@@ -1909,7 +1909,7 @@
                 <w:rFonts w:ascii="Arial" w:hAnsi="Arial"/>
                 <w:sz w:val="20"/>
               </w:rPr>
-              <w:t>Student or Faculty/Staff</w:t>
+              <w:t>Student or Faculty</w:t>
             </w:r>
           </w:p>
         </w:tc>
@@ -2742,7 +2742,7 @@
                 <w:rFonts w:ascii="Arial" w:hAnsi="Arial"/>
                 <w:sz w:val="20"/>
               </w:rPr>
-              <w:t>Student or Faculty/Staff through Submit Feedback (UC-03)</w:t>
+              <w:t>Student or Faculty through Submit Feedback (UC-03)</w:t>
             </w:r>
           </w:p>
         </w:tc>
@@ -3575,7 +3575,7 @@
                 <w:rFonts w:ascii="Arial" w:hAnsi="Arial"/>
                 <w:sz w:val="20"/>
               </w:rPr>
-              <w:t>Student, Faculty/Staff, Admin or Super Admin</w:t>
+              <w:t>Student, Faculty, Admin or Super Admin</w:t>
             </w:r>
           </w:p>
         </w:tc>
@@ -4408,7 +4408,7 @@
                 <w:rFonts w:ascii="Arial" w:hAnsi="Arial"/>
                 <w:sz w:val="20"/>
               </w:rPr>
-              <w:t>Student or Faculty/Staff through Submit Feedback (UC-03)</w:t>
+              <w:t>Student or Faculty through Submit Feedback (UC-03)</w:t>
             </w:r>
           </w:p>
         </w:tc>
@@ -4460,7 +4460,7 @@
                 <w:rFonts w:ascii="Arial" w:hAnsi="Arial"/>
                 <w:sz w:val="20"/>
               </w:rPr>
-              <w:t>None</w:t>
+              <w:t>Google Gemini API (hosted Gemma inference service)</w:t>
             </w:r>
           </w:p>
         </w:tc>
@@ -5241,7 +5241,7 @@
                 <w:rFonts w:ascii="Arial" w:hAnsi="Arial"/>
                 <w:sz w:val="20"/>
               </w:rPr>
-              <w:t>Student or Faculty/Staff</w:t>
+              <w:t>Student or Faculty</w:t>
             </w:r>
           </w:p>
         </w:tc>
@@ -5345,7 +5345,7 @@
                 <w:rFonts w:ascii="Arial" w:hAnsi="Arial"/>
                 <w:sz w:val="20"/>
               </w:rPr>
-              <w:t>The Student or Faculty/Staff member is signed in with an active account. Feedback history is restricted to the account owner.</w:t>
+              <w:t>The Student or Faculty member is signed in with an active account. Feedback history is restricted to the account owner.</w:t>
             </w:r>
           </w:p>
         </w:tc>
@@ -6074,7 +6074,7 @@
                 <w:rFonts w:ascii="Arial" w:hAnsi="Arial"/>
                 <w:sz w:val="20"/>
               </w:rPr>
-              <w:t>Faculty/Staff, Admin or Super Admin</w:t>
+              <w:t>Faculty, Admin or Super Admin</w:t>
             </w:r>
           </w:p>
         </w:tc>
@@ -6907,7 +6907,7 @@
                 <w:rFonts w:ascii="Arial" w:hAnsi="Arial"/>
                 <w:sz w:val="20"/>
               </w:rPr>
-              <w:t>Faculty/Staff, Admin or Super Admin</w:t>
+              <w:t>Faculty, Admin or Super Admin</w:t>
             </w:r>
           </w:p>
         </w:tc>
@@ -7740,7 +7740,7 @@
                 <w:rFonts w:ascii="Arial" w:hAnsi="Arial"/>
                 <w:sz w:val="20"/>
               </w:rPr>
-              <w:t>Faculty/Staff, Admin or Super Admin</w:t>
+              <w:t>Faculty, Admin or Super Admin</w:t>
             </w:r>
           </w:p>
         </w:tc>
@@ -8573,7 +8573,7 @@
                 <w:rFonts w:ascii="Arial" w:hAnsi="Arial"/>
                 <w:sz w:val="20"/>
               </w:rPr>
-              <w:t>Faculty/Staff, Admin or Super Admin</w:t>
+              <w:t>Faculty, Admin or Super Admin</w:t>
             </w:r>
           </w:p>
         </w:tc>
@@ -9936,7 +9936,7 @@
                 <w:rFonts w:ascii="Arial" w:hAnsi="Arial"/>
                 <w:sz w:val="20"/>
               </w:rPr>
-              <w:t>6a. A Faculty/Staff or Student user cannot delete feedback. A missing record or database failure prevents successful deletion.</w:t>
+              <w:t>6a. A Faculty or Student user cannot delete feedback. A missing record or database failure prevents successful deletion.</w:t>
             </w:r>
           </w:p>
         </w:tc>
@@ -13571,7 +13571,7 @@
                 <w:rFonts w:ascii="Arial" w:hAnsi="Arial"/>
                 <w:sz w:val="20"/>
               </w:rPr>
-              <w:t>Student, Faculty/Staff, Admin or Super Admin</w:t>
+              <w:t>Student, Faculty, Admin or Super Admin</w:t>
             </w:r>
           </w:p>
         </w:tc>

</xml_diff>

<commit_message>
docs(use-cases): correct flow numbering and remove empty placeholders
</commit_message>
<xml_diff>
--- a/diagrams/use-case-description/ResBack Use Case Descriptions.docx
+++ b/diagrams/use-case-description/ResBack Use Case Descriptions.docx
@@ -614,7 +614,7 @@
                 <w:rFonts w:ascii="Arial" w:hAnsi="Arial"/>
                 <w:sz w:val="20"/>
               </w:rPr>
-              <w:t>5. None</w:t>
+              <w:t/>
             </w:r>
           </w:p>
         </w:tc>
@@ -632,7 +632,7 @@
                 <w:rFonts w:ascii="Arial" w:hAnsi="Arial"/>
                 <w:sz w:val="20"/>
               </w:rPr>
-              <w:t>6. Saves the account with the Student role and a hashed password.</w:t>
+              <w:t>5. Saves the account with the Student role and a hashed password.</w:t>
             </w:r>
           </w:p>
         </w:tc>
@@ -662,7 +662,7 @@
                 <w:rFonts w:ascii="Arial" w:hAnsi="Arial"/>
                 <w:sz w:val="20"/>
               </w:rPr>
-              <w:t>7. None</w:t>
+              <w:t/>
             </w:r>
           </w:p>
         </w:tc>
@@ -680,7 +680,7 @@
                 <w:rFonts w:ascii="Arial" w:hAnsi="Arial"/>
                 <w:sz w:val="20"/>
               </w:rPr>
-              <w:t>8. Starts an authenticated session and displays the feedback form.</w:t>
+              <w:t>6. Starts an authenticated session and displays the feedback form.</w:t>
             </w:r>
           </w:p>
         </w:tc>
@@ -1447,7 +1447,7 @@
                 <w:rFonts w:ascii="Arial" w:hAnsi="Arial"/>
                 <w:sz w:val="20"/>
               </w:rPr>
-              <w:t>5. None</w:t>
+              <w:t/>
             </w:r>
           </w:p>
         </w:tc>
@@ -1465,7 +1465,7 @@
                 <w:rFonts w:ascii="Arial" w:hAnsi="Arial"/>
                 <w:sz w:val="20"/>
               </w:rPr>
-              <w:t>6. Starts an authenticated session and regenerates the session identifier.</w:t>
+              <w:t>5. Starts an authenticated session and regenerates the session identifier.</w:t>
             </w:r>
           </w:p>
         </w:tc>
@@ -1495,7 +1495,7 @@
                 <w:rFonts w:ascii="Arial" w:hAnsi="Arial"/>
                 <w:sz w:val="20"/>
               </w:rPr>
-              <w:t>7. None</w:t>
+              <w:t/>
             </w:r>
           </w:p>
         </w:tc>
@@ -1513,7 +1513,7 @@
                 <w:rFonts w:ascii="Arial" w:hAnsi="Arial"/>
                 <w:sz w:val="20"/>
               </w:rPr>
-              <w:t>8. Opens the Student feedback form or the Faculty, Admin or Super Admin dashboard according to the account role.</w:t>
+              <w:t>6. Opens the Student feedback form or the Faculty, Admin or Super Admin dashboard according to the account role.</w:t>
             </w:r>
           </w:p>
         </w:tc>
@@ -2280,7 +2280,7 @@
                 <w:rFonts w:ascii="Arial" w:hAnsi="Arial"/>
                 <w:sz w:val="20"/>
               </w:rPr>
-              <w:t>5. None</w:t>
+              <w:t/>
             </w:r>
           </w:p>
         </w:tc>
@@ -2298,7 +2298,7 @@
                 <w:rFonts w:ascii="Arial" w:hAnsi="Arial"/>
                 <w:sz w:val="20"/>
               </w:rPr>
-              <w:t>6. Performs Screen Feedback (UC-04) and saves accepted feedback as pending.</w:t>
+              <w:t>5. Performs Screen Feedback (UC-04) and saves accepted feedback as pending.</w:t>
             </w:r>
           </w:p>
         </w:tc>
@@ -2328,7 +2328,7 @@
                 <w:rFonts w:ascii="Arial" w:hAnsi="Arial"/>
                 <w:sz w:val="20"/>
               </w:rPr>
-              <w:t>7. None</w:t>
+              <w:t/>
             </w:r>
           </w:p>
         </w:tc>
@@ -2346,7 +2346,7 @@
                 <w:rFonts w:ascii="Arial" w:hAnsi="Arial"/>
                 <w:sz w:val="20"/>
               </w:rPr>
-              <w:t>8. Performs Analyze Accepted Feedback (UC-06) and displays the stored status and available analysis.</w:t>
+              <w:t>6. Performs Analyze Accepted Feedback (UC-06) and displays the stored status and available analysis.</w:t>
             </w:r>
           </w:p>
         </w:tc>
@@ -2388,7 +2388,7 @@
                 <w:rFonts w:ascii="Arial" w:hAnsi="Arial"/>
                 <w:sz w:val="20"/>
               </w:rPr>
-              <w:t>6a. If screening detects prohibited content, the system saves the feedback as rejected, displays the rejection result and skips UC-06.</w:t>
+              <w:t>5a. If screening detects prohibited content, the system saves the feedback as rejected, displays the rejection result and skips UC-06.</w:t>
             </w:r>
           </w:p>
         </w:tc>
@@ -2439,7 +2439,7 @@
                 <w:rFonts w:ascii="Arial" w:hAnsi="Arial"/>
                 <w:sz w:val="20"/>
               </w:rPr>
-              <w:t>4a. Invalid content/category, duplicate feedback or exceeding the submission limit prevents saving. 8a. Analysis failure leaves the saved feedback marked failed.</w:t>
+              <w:t>4a. Invalid content/category, duplicate feedback or exceeding the submission limit prevents saving. 6a. Analysis failure leaves the saved feedback marked failed.</w:t>
             </w:r>
           </w:p>
         </w:tc>
@@ -3017,7 +3017,7 @@
                 <w:rFonts w:ascii="Arial" w:hAnsi="Arial"/>
                 <w:sz w:val="20"/>
               </w:rPr>
-              <w:t>1. None</w:t>
+              <w:t/>
             </w:r>
           </w:p>
         </w:tc>
@@ -3035,7 +3035,7 @@
                 <w:rFonts w:ascii="Arial" w:hAnsi="Arial"/>
                 <w:sz w:val="20"/>
               </w:rPr>
-              <w:t>2. Receives the validated feedback text from Submit Feedback (UC-03).</w:t>
+              <w:t>1. Receives the validated feedback text from Submit Feedback (UC-03).</w:t>
             </w:r>
           </w:p>
         </w:tc>
@@ -3065,7 +3065,7 @@
                 <w:rFonts w:ascii="Arial" w:hAnsi="Arial"/>
                 <w:sz w:val="20"/>
               </w:rPr>
-              <w:t>3. None</w:t>
+              <w:t/>
             </w:r>
           </w:p>
         </w:tc>
@@ -3083,7 +3083,7 @@
                 <w:rFonts w:ascii="Arial" w:hAnsi="Arial"/>
                 <w:sz w:val="20"/>
               </w:rPr>
-              <w:t>4. Normalizes the text and configured blocked terms and their variants.</w:t>
+              <w:t>2. Normalizes the text and configured blocked terms and their variants.</w:t>
             </w:r>
           </w:p>
         </w:tc>
@@ -3113,7 +3113,7 @@
                 <w:rFonts w:ascii="Arial" w:hAnsi="Arial"/>
                 <w:sz w:val="20"/>
               </w:rPr>
-              <w:t>5. None</w:t>
+              <w:t/>
             </w:r>
           </w:p>
         </w:tc>
@@ -3131,7 +3131,7 @@
                 <w:rFonts w:ascii="Arial" w:hAnsi="Arial"/>
                 <w:sz w:val="20"/>
               </w:rPr>
-              <w:t>6. Checks the normalized text for prohibited matches.</w:t>
+              <w:t>3. Checks the normalized text for prohibited matches.</w:t>
             </w:r>
           </w:p>
         </w:tc>
@@ -3161,7 +3161,7 @@
                 <w:rFonts w:ascii="Arial" w:hAnsi="Arial"/>
                 <w:sz w:val="20"/>
               </w:rPr>
-              <w:t>7. None</w:t>
+              <w:t/>
             </w:r>
           </w:p>
         </w:tc>
@@ -3179,7 +3179,7 @@
                 <w:rFonts w:ascii="Arial" w:hAnsi="Arial"/>
                 <w:sz w:val="20"/>
               </w:rPr>
-              <w:t>8. Returns an accepted decision to UC-03 when no prohibited match is found; UC-03 saves the feedback as pending and continues to UC-06.</w:t>
+              <w:t>4. Returns an accepted decision to UC-03 when no prohibited match is found; UC-03 saves the feedback as pending and continues to UC-06.</w:t>
             </w:r>
           </w:p>
         </w:tc>
@@ -3221,7 +3221,7 @@
                 <w:rFonts w:ascii="Arial" w:hAnsi="Arial"/>
                 <w:sz w:val="20"/>
               </w:rPr>
-              <w:t>6a. A prohibited match returns a rejected decision to UC-03. The system saves the record as rejected, displays the rejection result and skips UC-06.</w:t>
+              <w:t>3a. A prohibited match returns a rejected decision to UC-03. The system saves the record as rejected, displays the rejection result and skips UC-06.</w:t>
             </w:r>
           </w:p>
         </w:tc>
@@ -3272,7 +3272,7 @@
                 <w:rFonts w:ascii="Arial" w:hAnsi="Arial"/>
                 <w:sz w:val="20"/>
               </w:rPr>
-              <w:t>4a/6a. A screening error prevents successful completion; the system must not report the submission as successfully analyzed.</w:t>
+              <w:t>2a/3a. A screening error prevents successful completion; the system must not report the submission as successfully analyzed.</w:t>
             </w:r>
           </w:p>
         </w:tc>
@@ -3946,7 +3946,7 @@
                 <w:rFonts w:ascii="Arial" w:hAnsi="Arial"/>
                 <w:sz w:val="20"/>
               </w:rPr>
-              <w:t>5. None</w:t>
+              <w:t/>
             </w:r>
           </w:p>
         </w:tc>
@@ -3964,7 +3964,7 @@
                 <w:rFonts w:ascii="Arial" w:hAnsi="Arial"/>
                 <w:sz w:val="20"/>
               </w:rPr>
-              <w:t>6. Stores or removes the profile photo as requested and updates only the signed-in user's profile.</w:t>
+              <w:t>5. Stores or removes the profile photo as requested and updates only the signed-in user's profile.</w:t>
             </w:r>
           </w:p>
         </w:tc>
@@ -3994,7 +3994,7 @@
                 <w:rFonts w:ascii="Arial" w:hAnsi="Arial"/>
                 <w:sz w:val="20"/>
               </w:rPr>
-              <w:t>7. None</w:t>
+              <w:t/>
             </w:r>
           </w:p>
         </w:tc>
@@ -4012,7 +4012,7 @@
                 <w:rFonts w:ascii="Arial" w:hAnsi="Arial"/>
                 <w:sz w:val="20"/>
               </w:rPr>
-              <w:t>8. Displays the updated profile and a confirmation message.</w:t>
+              <w:t>6. Displays the updated profile and a confirmation message.</w:t>
             </w:r>
           </w:p>
         </w:tc>
@@ -4105,7 +4105,7 @@
                 <w:rFonts w:ascii="Arial" w:hAnsi="Arial"/>
                 <w:sz w:val="20"/>
               </w:rPr>
-              <w:t>4a. A duplicate/invalid nickname or an invalid photo prevents the update. 6a. A photo-storage failure prevents successful completion.</w:t>
+              <w:t>4a. A duplicate/invalid nickname or an invalid photo prevents the update. 5a. A photo-storage failure prevents successful completion.</w:t>
             </w:r>
           </w:p>
         </w:tc>
@@ -4683,7 +4683,7 @@
                 <w:rFonts w:ascii="Arial" w:hAnsi="Arial"/>
                 <w:sz w:val="20"/>
               </w:rPr>
-              <w:t>1. None</w:t>
+              <w:t/>
             </w:r>
           </w:p>
         </w:tc>
@@ -4701,7 +4701,7 @@
                 <w:rFonts w:ascii="Arial" w:hAnsi="Arial"/>
                 <w:sz w:val="20"/>
               </w:rPr>
-              <w:t>2. Starts analysis for the accepted feedback record saved as pending by UC-03.</w:t>
+              <w:t>1. Starts analysis for the accepted feedback record saved as pending by UC-03.</w:t>
             </w:r>
           </w:p>
         </w:tc>
@@ -4731,7 +4731,7 @@
                 <w:rFonts w:ascii="Arial" w:hAnsi="Arial"/>
                 <w:sz w:val="20"/>
               </w:rPr>
-              <w:t>3. None</w:t>
+              <w:t/>
             </w:r>
           </w:p>
         </w:tc>
@@ -4749,7 +4749,7 @@
                 <w:rFonts w:ascii="Arial" w:hAnsi="Arial"/>
                 <w:sz w:val="20"/>
               </w:rPr>
-              <w:t>4. Sends the feedback to the Gemini API with the required classification instructions.</w:t>
+              <w:t>2. Sends the feedback to the Gemini API with the required classification instructions.</w:t>
             </w:r>
           </w:p>
         </w:tc>
@@ -4779,7 +4779,7 @@
                 <w:rFonts w:ascii="Arial" w:hAnsi="Arial"/>
                 <w:sz w:val="20"/>
               </w:rPr>
-              <w:t>5. None</w:t>
+              <w:t/>
             </w:r>
           </w:p>
         </w:tc>
@@ -4797,7 +4797,7 @@
                 <w:rFonts w:ascii="Arial" w:hAnsi="Arial"/>
                 <w:sz w:val="20"/>
               </w:rPr>
-              <w:t>6. Receives and validates the returned sentiment, confidence, keywords, topics and language data.</w:t>
+              <w:t>3. Receives and validates the returned sentiment, confidence, keywords, topics and language data.</w:t>
             </w:r>
           </w:p>
         </w:tc>
@@ -4827,7 +4827,7 @@
                 <w:rFonts w:ascii="Arial" w:hAnsi="Arial"/>
                 <w:sz w:val="20"/>
               </w:rPr>
-              <w:t>7. None</w:t>
+              <w:t/>
             </w:r>
           </w:p>
         </w:tc>
@@ -4845,7 +4845,7 @@
                 <w:rFonts w:ascii="Arial" w:hAnsi="Arial"/>
                 <w:sz w:val="20"/>
               </w:rPr>
-              <w:t>8. Saves the result, marks the feedback analyzed and rebuilds the concern rankings; returns control to UC-03 to display the result.</w:t>
+              <w:t>4. Saves the result, marks the feedback analyzed and rebuilds the concern rankings; returns control to UC-03 to display the result.</w:t>
             </w:r>
           </w:p>
         </w:tc>
@@ -4887,7 +4887,7 @@
                 <w:rFonts w:ascii="Arial" w:hAnsi="Arial"/>
                 <w:sz w:val="20"/>
               </w:rPr>
-              <w:t>4a. A temporary request failure may trigger a retry before the final result is determined.</w:t>
+              <w:t>2a. A temporary request failure may trigger a retry before the final result is determined.</w:t>
             </w:r>
           </w:p>
         </w:tc>
@@ -4938,7 +4938,7 @@
                 <w:rFonts w:ascii="Arial" w:hAnsi="Arial"/>
                 <w:sz w:val="20"/>
               </w:rPr>
-              <w:t>4a/6a. Missing configuration, connection failure, API error or unusable output marks the saved feedback failed; it does not create a successful analysis result.</w:t>
+              <w:t>2a/3a. Missing configuration, connection failure, API error or unusable output marks the saved feedback failed; it does not create a successful analysis result.</w:t>
             </w:r>
           </w:p>
         </w:tc>
@@ -5564,7 +5564,7 @@
                 <w:rFonts w:ascii="Arial" w:hAnsi="Arial"/>
                 <w:sz w:val="20"/>
               </w:rPr>
-              <w:t>3. None</w:t>
+              <w:t/>
             </w:r>
           </w:p>
         </w:tc>
@@ -5582,7 +5582,7 @@
                 <w:rFonts w:ascii="Arial" w:hAnsi="Arial"/>
                 <w:sz w:val="20"/>
               </w:rPr>
-              <w:t>4. Retrieves only the user's feedback records with their categories and available analysis, newest first.</w:t>
+              <w:t>3. Retrieves only the user's feedback records with their categories and available analysis, newest first.</w:t>
             </w:r>
           </w:p>
         </w:tc>
@@ -5612,7 +5612,7 @@
                 <w:rFonts w:ascii="Arial" w:hAnsi="Arial"/>
                 <w:sz w:val="20"/>
               </w:rPr>
-              <w:t>5. None</w:t>
+              <w:t/>
             </w:r>
           </w:p>
         </w:tc>
@@ -5630,7 +5630,7 @@
                 <w:rFonts w:ascii="Arial" w:hAnsi="Arial"/>
                 <w:sz w:val="20"/>
               </w:rPr>
-              <w:t>6. Displays the personal feedback history, processing statuses and available analysis in a paginated list.</w:t>
+              <w:t>4. Displays the personal feedback history, processing statuses and available analysis in a paginated list.</w:t>
             </w:r>
           </w:p>
         </w:tc>
@@ -5660,7 +5660,7 @@
                 <w:rFonts w:ascii="Arial" w:hAnsi="Arial"/>
                 <w:sz w:val="20"/>
               </w:rPr>
-              <w:t>7. Selects the next or previous history page when available.</w:t>
+              <w:t>5. Selects the next or previous history page when available.</w:t>
             </w:r>
           </w:p>
         </w:tc>
@@ -5678,7 +5678,7 @@
                 <w:rFonts w:ascii="Arial" w:hAnsi="Arial"/>
                 <w:sz w:val="20"/>
               </w:rPr>
-              <w:t>8. Displays the requested page of the same user's records.</w:t>
+              <w:t>6. Displays the requested page of the same user's records.</w:t>
             </w:r>
           </w:p>
         </w:tc>
@@ -5720,7 +5720,7 @@
                 <w:rFonts w:ascii="Arial" w:hAnsi="Arial"/>
                 <w:sz w:val="20"/>
               </w:rPr>
-              <w:t>4a. If the user has no submissions, the system displays an empty history. 6a. Records without analysis show their current status.</w:t>
+              <w:t>3a. If the user has no submissions, the system displays an empty history. 4a. Records without analysis show their current status.</w:t>
             </w:r>
           </w:p>
         </w:tc>
@@ -6397,7 +6397,7 @@
                 <w:rFonts w:ascii="Arial" w:hAnsi="Arial"/>
                 <w:sz w:val="20"/>
               </w:rPr>
-              <w:t>3. None</w:t>
+              <w:t/>
             </w:r>
           </w:p>
         </w:tc>
@@ -6415,7 +6415,7 @@
                 <w:rFonts w:ascii="Arial" w:hAnsi="Arial"/>
                 <w:sz w:val="20"/>
               </w:rPr>
-              <w:t>4. Calculates feedback counts, sentiment and language distributions and trends.</w:t>
+              <w:t>3. Calculates feedback counts, sentiment and language distributions and trends.</w:t>
             </w:r>
           </w:p>
         </w:tc>
@@ -6445,7 +6445,7 @@
                 <w:rFonts w:ascii="Arial" w:hAnsi="Arial"/>
                 <w:sz w:val="20"/>
               </w:rPr>
-              <w:t>5. None</w:t>
+              <w:t/>
             </w:r>
           </w:p>
         </w:tc>
@@ -6463,7 +6463,7 @@
                 <w:rFonts w:ascii="Arial" w:hAnsi="Arial"/>
                 <w:sz w:val="20"/>
               </w:rPr>
-              <w:t>6. Builds the leading concern rankings and retrieves the paginated feedback list.</w:t>
+              <w:t>4. Builds the leading concern rankings and retrieves the paginated feedback list.</w:t>
             </w:r>
           </w:p>
         </w:tc>
@@ -6493,7 +6493,7 @@
                 <w:rFonts w:ascii="Arial" w:hAnsi="Arial"/>
                 <w:sz w:val="20"/>
               </w:rPr>
-              <w:t>7. None</w:t>
+              <w:t/>
             </w:r>
           </w:p>
         </w:tc>
@@ -6511,7 +6511,7 @@
                 <w:rFonts w:ascii="Arial" w:hAnsi="Arial"/>
                 <w:sz w:val="20"/>
               </w:rPr>
-              <w:t>8. Displays the dashboard summaries, charts, concerns and feedback, with Filter Feedback (UC-09), Download PDF Report (UC-10) and Export Feedback (UC-11).</w:t>
+              <w:t>5. Displays the dashboard summaries, charts, concerns and feedback, with Filter Feedback (UC-09), Download PDF Report (UC-10) and Export Feedback (UC-11).</w:t>
             </w:r>
           </w:p>
         </w:tc>
@@ -6553,7 +6553,7 @@
                 <w:rFonts w:ascii="Arial" w:hAnsi="Arial"/>
                 <w:sz w:val="20"/>
               </w:rPr>
-              <w:t>2a. With no reportable records, the dashboard shows zero totals and an empty list. After step 8, the user may activate UC-09, UC-10 or UC-11.</w:t>
+              <w:t>2a. With no reportable records, the dashboard shows zero totals and an empty list. After step 5, the user may activate UC-09, UC-10 or UC-11.</w:t>
             </w:r>
           </w:p>
         </w:tc>
@@ -7278,7 +7278,7 @@
                 <w:rFonts w:ascii="Arial" w:hAnsi="Arial"/>
                 <w:sz w:val="20"/>
               </w:rPr>
-              <w:t>5. None</w:t>
+              <w:t/>
             </w:r>
           </w:p>
         </w:tc>
@@ -7296,7 +7296,7 @@
                 <w:rFonts w:ascii="Arial" w:hAnsi="Arial"/>
                 <w:sz w:val="20"/>
               </w:rPr>
-              <w:t>6. Retrieves matching reportable feedback and recalculates analytics for the selected scope.</w:t>
+              <w:t>5. Retrieves matching reportable feedback and recalculates analytics for the selected scope.</w:t>
             </w:r>
           </w:p>
         </w:tc>
@@ -7326,7 +7326,7 @@
                 <w:rFonts w:ascii="Arial" w:hAnsi="Arial"/>
                 <w:sz w:val="20"/>
               </w:rPr>
-              <w:t>7. None</w:t>
+              <w:t/>
             </w:r>
           </w:p>
         </w:tc>
@@ -7344,7 +7344,7 @@
                 <w:rFonts w:ascii="Arial" w:hAnsi="Arial"/>
                 <w:sz w:val="20"/>
               </w:rPr>
-              <w:t>8. Displays the filtered feedback and analytics; retains the scope for PDF and spreadsheet downloads.</w:t>
+              <w:t>6. Displays the filtered feedback and analytics; retains the scope for PDF and spreadsheet downloads.</w:t>
             </w:r>
           </w:p>
         </w:tc>
@@ -7386,7 +7386,7 @@
                 <w:rFonts w:ascii="Arial" w:hAnsi="Arial"/>
                 <w:sz w:val="20"/>
               </w:rPr>
-              <w:t>3a. The user clears optional filters to restore the default CCIS view. 6a. No matching records produces an empty result.</w:t>
+              <w:t>3a. The user clears optional filters to restore the default CCIS view. 5a. No matching records produces an empty result.</w:t>
             </w:r>
           </w:p>
         </w:tc>
@@ -8063,7 +8063,7 @@
                 <w:rFonts w:ascii="Arial" w:hAnsi="Arial"/>
                 <w:sz w:val="20"/>
               </w:rPr>
-              <w:t>3. None</w:t>
+              <w:t/>
             </w:r>
           </w:p>
         </w:tc>
@@ -8081,7 +8081,7 @@
                 <w:rFonts w:ascii="Arial" w:hAnsi="Arial"/>
                 <w:sz w:val="20"/>
               </w:rPr>
-              <w:t>4. Retrieves matching reportable CCIS feedback and calculates summaries and concern rankings.</w:t>
+              <w:t>3. Retrieves matching reportable CCIS feedback and calculates summaries and concern rankings.</w:t>
             </w:r>
           </w:p>
         </w:tc>
@@ -8111,7 +8111,7 @@
                 <w:rFonts w:ascii="Arial" w:hAnsi="Arial"/>
                 <w:sz w:val="20"/>
               </w:rPr>
-              <w:t>5. None</w:t>
+              <w:t/>
             </w:r>
           </w:p>
         </w:tc>
@@ -8129,7 +8129,7 @@
                 <w:rFonts w:ascii="Arial" w:hAnsi="Arial"/>
                 <w:sz w:val="20"/>
               </w:rPr>
-              <w:t>6. Renders the PDF report with the selected scope and page numbering.</w:t>
+              <w:t>4. Renders the PDF report with the selected scope and page numbering.</w:t>
             </w:r>
           </w:p>
         </w:tc>
@@ -8159,7 +8159,7 @@
                 <w:rFonts w:ascii="Arial" w:hAnsi="Arial"/>
                 <w:sz w:val="20"/>
               </w:rPr>
-              <w:t>7. None</w:t>
+              <w:t/>
             </w:r>
           </w:p>
         </w:tc>
@@ -8177,7 +8177,7 @@
                 <w:rFonts w:ascii="Arial" w:hAnsi="Arial"/>
                 <w:sz w:val="20"/>
               </w:rPr>
-              <w:t>8. Returns the PDF for download with a descriptive filename.</w:t>
+              <w:t>5. Returns the PDF for download with a descriptive filename.</w:t>
             </w:r>
           </w:p>
         </w:tc>
@@ -8219,7 +8219,7 @@
                 <w:rFonts w:ascii="Arial" w:hAnsi="Arial"/>
                 <w:sz w:val="20"/>
               </w:rPr>
-              <w:t>1a. With no optional filters, the report uses the default CCIS scope. 4a. With no matching feedback, the report contains the available zero/empty summaries.</w:t>
+              <w:t>1a. With no optional filters, the report uses the default CCIS scope. 3a. With no matching feedback, the report contains the available zero/empty summaries.</w:t>
             </w:r>
           </w:p>
         </w:tc>
@@ -8270,7 +8270,7 @@
                 <w:rFonts w:ascii="Arial" w:hAnsi="Arial"/>
                 <w:sz w:val="20"/>
               </w:rPr>
-              <w:t>2a. Invalid filters or unauthorized access prevents download. 4a/6a. A retrieval or PDF-generation failure prevents a completed report.</w:t>
+              <w:t>2a. Invalid filters or unauthorized access prevents download. 3a/4a. A retrieval or PDF-generation failure prevents a completed report.</w:t>
             </w:r>
           </w:p>
         </w:tc>
@@ -8896,7 +8896,7 @@
                 <w:rFonts w:ascii="Arial" w:hAnsi="Arial"/>
                 <w:sz w:val="20"/>
               </w:rPr>
-              <w:t>3. None</w:t>
+              <w:t/>
             </w:r>
           </w:p>
         </w:tc>
@@ -8914,7 +8914,7 @@
                 <w:rFonts w:ascii="Arial" w:hAnsi="Arial"/>
                 <w:sz w:val="20"/>
               </w:rPr>
-              <w:t>4. Retrieves matching reportable CCIS feedback and available analysis.</w:t>
+              <w:t>3. Retrieves matching reportable CCIS feedback and available analysis.</w:t>
             </w:r>
           </w:p>
         </w:tc>
@@ -8944,7 +8944,7 @@
                 <w:rFonts w:ascii="Arial" w:hAnsi="Arial"/>
                 <w:sz w:val="20"/>
               </w:rPr>
-              <w:t>5. None</w:t>
+              <w:t/>
             </w:r>
           </w:p>
         </w:tc>
@@ -8962,7 +8962,7 @@
                 <w:rFonts w:ascii="Arial" w:hAnsi="Arial"/>
                 <w:sz w:val="20"/>
               </w:rPr>
-              <w:t>6. Writes feedback, dates, statuses and analysis into an XLSX spreadsheet with column headings and formatted values.</w:t>
+              <w:t>4. Writes feedback, dates, statuses and analysis into an XLSX spreadsheet with column headings and formatted values.</w:t>
             </w:r>
           </w:p>
         </w:tc>
@@ -8992,7 +8992,7 @@
                 <w:rFonts w:ascii="Arial" w:hAnsi="Arial"/>
                 <w:sz w:val="20"/>
               </w:rPr>
-              <w:t>7. None</w:t>
+              <w:t/>
             </w:r>
           </w:p>
         </w:tc>
@@ -9010,7 +9010,7 @@
                 <w:rFonts w:ascii="Arial" w:hAnsi="Arial"/>
                 <w:sz w:val="20"/>
               </w:rPr>
-              <w:t>8. Returns the XLSX file for download with a descriptive filename.</w:t>
+              <w:t>5. Returns the XLSX file for download with a descriptive filename.</w:t>
             </w:r>
           </w:p>
         </w:tc>
@@ -9052,7 +9052,7 @@
                 <w:rFonts w:ascii="Arial" w:hAnsi="Arial"/>
                 <w:sz w:val="20"/>
               </w:rPr>
-              <w:t>1a. With no optional filters, the export uses the default CCIS scope. 4a. No matching feedback produces a spreadsheet containing the column headings.</w:t>
+              <w:t>1a. With no optional filters, the export uses the default CCIS scope. 3a. No matching feedback produces a spreadsheet containing the column headings.</w:t>
             </w:r>
           </w:p>
         </w:tc>
@@ -9103,7 +9103,7 @@
                 <w:rFonts w:ascii="Arial" w:hAnsi="Arial"/>
                 <w:sz w:val="20"/>
               </w:rPr>
-              <w:t>2a. Invalid filters or unauthorized access prevents export. 4a/6a. A retrieval or spreadsheet-generation failure prevents a completed download.</w:t>
+              <w:t>2a. Invalid filters or unauthorized access prevents export. 3a/4a. A retrieval or spreadsheet-generation failure prevents a completed download.</w:t>
             </w:r>
           </w:p>
         </w:tc>
@@ -9825,7 +9825,7 @@
                 <w:rFonts w:ascii="Arial" w:hAnsi="Arial"/>
                 <w:sz w:val="20"/>
               </w:rPr>
-              <w:t>7. None</w:t>
+              <w:t/>
             </w:r>
           </w:p>
         </w:tc>
@@ -9843,7 +9843,7 @@
                 <w:rFonts w:ascii="Arial" w:hAnsi="Arial"/>
                 <w:sz w:val="20"/>
               </w:rPr>
-              <w:t>8. Displays confirmation and the remaining feedback records.</w:t>
+              <w:t>7. Displays confirmation and the remaining feedback records.</w:t>
             </w:r>
           </w:p>
         </w:tc>
@@ -10610,7 +10610,7 @@
                 <w:rFonts w:ascii="Arial" w:hAnsi="Arial"/>
                 <w:sz w:val="20"/>
               </w:rPr>
-              <w:t>5. None</w:t>
+              <w:t/>
             </w:r>
           </w:p>
         </w:tc>
@@ -10628,7 +10628,7 @@
                 <w:rFonts w:ascii="Arial" w:hAnsi="Arial"/>
                 <w:sz w:val="20"/>
               </w:rPr>
-              <w:t>6. Retrieves accounts matching the nickname search.</w:t>
+              <w:t>5. Retrieves accounts matching the nickname search.</w:t>
             </w:r>
           </w:p>
         </w:tc>
@@ -10658,7 +10658,7 @@
                 <w:rFonts w:ascii="Arial" w:hAnsi="Arial"/>
                 <w:sz w:val="20"/>
               </w:rPr>
-              <w:t>7. None</w:t>
+              <w:t/>
             </w:r>
           </w:p>
         </w:tc>
@@ -10676,7 +10676,7 @@
                 <w:rFonts w:ascii="Arial" w:hAnsi="Arial"/>
                 <w:sz w:val="20"/>
               </w:rPr>
-              <w:t>8. Displays the paginated results while retaining the search criteria.</w:t>
+              <w:t>6. Displays the paginated results while retaining the search criteria.</w:t>
             </w:r>
           </w:p>
         </w:tc>
@@ -10718,7 +10718,7 @@
                 <w:rFonts w:ascii="Arial" w:hAnsi="Arial"/>
                 <w:sz w:val="20"/>
               </w:rPr>
-              <w:t>3a. An empty search displays the full paginated list. 6a. No matching nickname displays an empty result. After step 8, the administrator may select another result page or an authorized account action (UC-14, UC-15 or UC-16).</w:t>
+              <w:t>3a. An empty search displays the full paginated list. 5a. No matching nickname displays an empty result. After step 6, the administrator may select another result page or an authorized account action (UC-14, UC-15 or UC-16).</w:t>
             </w:r>
           </w:p>
         </w:tc>
@@ -11491,7 +11491,7 @@
                 <w:rFonts w:ascii="Arial" w:hAnsi="Arial"/>
                 <w:sz w:val="20"/>
               </w:rPr>
-              <w:t>7. None</w:t>
+              <w:t/>
             </w:r>
           </w:p>
         </w:tc>
@@ -11509,7 +11509,7 @@
                 <w:rFonts w:ascii="Arial" w:hAnsi="Arial"/>
                 <w:sz w:val="20"/>
               </w:rPr>
-              <w:t>8. Deletes the target account and displays the updated account list with a success message.</w:t>
+              <w:t>7. Deletes the target account and displays the updated account list with a success message.</w:t>
             </w:r>
           </w:p>
         </w:tc>
@@ -12276,7 +12276,7 @@
                 <w:rFonts w:ascii="Arial" w:hAnsi="Arial"/>
                 <w:sz w:val="20"/>
               </w:rPr>
-              <w:t>5. None</w:t>
+              <w:t/>
             </w:r>
           </w:p>
         </w:tc>
@@ -12294,7 +12294,7 @@
                 <w:rFonts w:ascii="Arial" w:hAnsi="Arial"/>
                 <w:sz w:val="20"/>
               </w:rPr>
-              <w:t>6. Validates the selected role. Admin may assign Student or Faculty; Super Admin may also assign Admin or Super Admin.</w:t>
+              <w:t>5. Validates the selected role. Admin may assign Student or Faculty; Super Admin may also assign Admin or Super Admin.</w:t>
             </w:r>
           </w:p>
         </w:tc>
@@ -12324,7 +12324,7 @@
                 <w:rFonts w:ascii="Arial" w:hAnsi="Arial"/>
                 <w:sz w:val="20"/>
               </w:rPr>
-              <w:t>7. None</w:t>
+              <w:t/>
             </w:r>
           </w:p>
         </w:tc>
@@ -12342,7 +12342,7 @@
                 <w:rFonts w:ascii="Arial" w:hAnsi="Arial"/>
                 <w:sz w:val="20"/>
               </w:rPr>
-              <w:t>8. Updates the target account role and displays confirmation.</w:t>
+              <w:t>6. Updates the target account role and displays confirmation.</w:t>
             </w:r>
           </w:p>
         </w:tc>
@@ -12435,7 +12435,7 @@
                 <w:rFonts w:ascii="Arial" w:hAnsi="Arial"/>
                 <w:sz w:val="20"/>
               </w:rPr>
-              <w:t>4a. Self-role changes or unauthorized management of an administrator account are blocked. 6a. An invalid or disallowed role prevents the update. A missing target or database failure prevents successful completion.</w:t>
+              <w:t>4a. Self-role changes or unauthorized management of an administrator account are blocked. 5a. An invalid or disallowed role prevents the update. A missing target or database failure prevents successful completion.</w:t>
             </w:r>
           </w:p>
         </w:tc>
@@ -13109,7 +13109,7 @@
                 <w:rFonts w:ascii="Arial" w:hAnsi="Arial"/>
                 <w:sz w:val="20"/>
               </w:rPr>
-              <w:t>5. None</w:t>
+              <w:t/>
             </w:r>
           </w:p>
         </w:tc>
@@ -13127,7 +13127,7 @@
                 <w:rFonts w:ascii="Arial" w:hAnsi="Arial"/>
                 <w:sz w:val="20"/>
               </w:rPr>
-              <w:t>6. Changes the target's active status to the opposite state and saves it.</w:t>
+              <w:t>5. Changes the target's active status to the opposite state and saves it.</w:t>
             </w:r>
           </w:p>
         </w:tc>
@@ -13157,7 +13157,7 @@
                 <w:rFonts w:ascii="Arial" w:hAnsi="Arial"/>
                 <w:sz w:val="20"/>
               </w:rPr>
-              <w:t>7. None</w:t>
+              <w:t/>
             </w:r>
           </w:p>
         </w:tc>
@@ -13175,7 +13175,7 @@
                 <w:rFonts w:ascii="Arial" w:hAnsi="Arial"/>
                 <w:sz w:val="20"/>
               </w:rPr>
-              <w:t>8. Displays the updated status and a confirmation message.</w:t>
+              <w:t>6. Displays the updated status and a confirmation message.</w:t>
             </w:r>
           </w:p>
         </w:tc>
@@ -13894,7 +13894,7 @@
                 <w:rFonts w:ascii="Arial" w:hAnsi="Arial"/>
                 <w:sz w:val="20"/>
               </w:rPr>
-              <w:t>3. None</w:t>
+              <w:t/>
             </w:r>
           </w:p>
         </w:tc>
@@ -13912,7 +13912,7 @@
                 <w:rFonts w:ascii="Arial" w:hAnsi="Arial"/>
                 <w:sz w:val="20"/>
               </w:rPr>
-              <w:t>4. Invalidates the session and clears its stored data.</w:t>
+              <w:t>3. Invalidates the session and clears its stored data.</w:t>
             </w:r>
           </w:p>
         </w:tc>
@@ -13942,7 +13942,7 @@
                 <w:rFonts w:ascii="Arial" w:hAnsi="Arial"/>
                 <w:sz w:val="20"/>
               </w:rPr>
-              <w:t>5. None</w:t>
+              <w:t/>
             </w:r>
           </w:p>
         </w:tc>
@@ -13960,7 +13960,7 @@
                 <w:rFonts w:ascii="Arial" w:hAnsi="Arial"/>
                 <w:sz w:val="20"/>
               </w:rPr>
-              <w:t>6. Regenerates the request-protection token.</w:t>
+              <w:t>4. Regenerates the request-protection token.</w:t>
             </w:r>
           </w:p>
         </w:tc>
@@ -13990,7 +13990,7 @@
                 <w:rFonts w:ascii="Arial" w:hAnsi="Arial"/>
                 <w:sz w:val="20"/>
               </w:rPr>
-              <w:t>7. None</w:t>
+              <w:t/>
             </w:r>
           </w:p>
         </w:tc>
@@ -14008,7 +14008,7 @@
                 <w:rFonts w:ascii="Arial" w:hAnsi="Arial"/>
                 <w:sz w:val="20"/>
               </w:rPr>
-              <w:t>8. Redirects the actor to Login (UC-02).</w:t>
+              <w:t>5. Redirects the actor to Login (UC-02).</w:t>
             </w:r>
           </w:p>
         </w:tc>

</xml_diff>